<commit_message>
Declare product learning capabilities and regenerate realistic v2 fixtures
Separate supported preferences from known product gaps, keep structural dates ISO, pair plausible drug regimens, add text-format lab results, and harden thirteen scans. Regeneration produces identical manifest hashes across two runs.

Co-Authored-By: Codex <noreply@openai.com>
</commit_message>
<xml_diff>
--- a/evals/learning-loop-v2/patients/P004/materials/就诊材料.docx
+++ b/evals/learning-loop-v2/patients/P004/materials/就诊材料.docx
@@ -27,6 +27,33 @@
           <w:sz w:val="22"/>
         </w:rPr>
         <w:t xml:space="preserve">女，1951年生</w:t>
+      </w:r>
+    </w:p>
+    <w:p>
+      <w:r>
+        <w:rPr>
+          <w:rFonts w:eastAsia="PingFang SC"/>
+          <w:sz w:val="22"/>
+        </w:rPr>
+        <w:t xml:space="preserve">检验复核记录</w:t>
+      </w:r>
+    </w:p>
+    <w:p>
+      <w:r>
+        <w:rPr>
+          <w:rFonts w:eastAsia="PingFang SC"/>
+          <w:sz w:val="22"/>
+        </w:rPr>
+        <w:t xml:space="preserve">2026-06-11 肌酐 0.86 mg/dL；2026/7/12 ALT 28 U/L</w:t>
+      </w:r>
+    </w:p>
+    <w:p>
+      <w:r>
+        <w:rPr>
+          <w:rFonts w:eastAsia="PingFang SC"/>
+          <w:sz w:val="22"/>
+        </w:rPr>
+        <w:t xml:space="preserve"/>
       </w:r>
     </w:p>
     <w:p>
@@ -80,6 +107,51 @@
           <w:rFonts w:eastAsia="PingFang SC"/>
           <w:sz w:val="22"/>
         </w:rPr>
+        <w:t xml:space="preserve">吸烟史：已戒烟，累计6年。饮酒史：每月4次少量饮酒。职业接触史：曾在木材加工岗位接触粉尘</w:t>
+      </w:r>
+    </w:p>
+    <w:p>
+      <w:r>
+        <w:rPr>
+          <w:rFonts w:eastAsia="PingFang SC"/>
+          <w:sz w:val="22"/>
+        </w:rPr>
+        <w:t xml:space="preserve"/>
+      </w:r>
+    </w:p>
+    <w:p>
+      <w:r>
+        <w:rPr>
+          <w:rFonts w:eastAsia="PingFang SC"/>
+          <w:sz w:val="22"/>
+        </w:rPr>
+        <w:t xml:space="preserve">出院诊断</w:t>
+      </w:r>
+    </w:p>
+    <w:p>
+      <w:r>
+        <w:rPr>
+          <w:rFonts w:eastAsia="PingFang SC"/>
+          <w:sz w:val="22"/>
+        </w:rPr>
+        <w:t xml:space="preserve">9月10日 确诊：高血压；9月10日 影像提示：肺微小结节；2026-06-11 影像提示：胆囊息肉</w:t>
+      </w:r>
+    </w:p>
+    <w:p>
+      <w:r>
+        <w:rPr>
+          <w:rFonts w:eastAsia="PingFang SC"/>
+          <w:sz w:val="22"/>
+        </w:rPr>
+        <w:t xml:space="preserve"/>
+      </w:r>
+    </w:p>
+    <w:p>
+      <w:r>
+        <w:rPr>
+          <w:rFonts w:eastAsia="PingFang SC"/>
+          <w:sz w:val="22"/>
+        </w:rPr>
         <w:t xml:space="preserve">2026-06-11 康复评估</w:t>
       </w:r>
     </w:p>
@@ -107,51 +179,6 @@
           <w:rFonts w:eastAsia="PingFang SC"/>
           <w:sz w:val="22"/>
         </w:rPr>
-        <w:t xml:space="preserve">出院诊断</w:t>
-      </w:r>
-    </w:p>
-    <w:p>
-      <w:r>
-        <w:rPr>
-          <w:rFonts w:eastAsia="PingFang SC"/>
-          <w:sz w:val="22"/>
-        </w:rPr>
-        <w:t xml:space="preserve">9月10日 高血压 [confirmed]；9月10日 肺微小结节 [finding]；2026-06-11 胆囊息肉 [finding]</w:t>
-      </w:r>
-    </w:p>
-    <w:p>
-      <w:r>
-        <w:rPr>
-          <w:rFonts w:eastAsia="PingFang SC"/>
-          <w:sz w:val="22"/>
-        </w:rPr>
-        <w:t xml:space="preserve"/>
-      </w:r>
-    </w:p>
-    <w:p>
-      <w:r>
-        <w:rPr>
-          <w:rFonts w:eastAsia="PingFang SC"/>
-          <w:sz w:val="22"/>
-        </w:rPr>
-        <w:t xml:space="preserve">吸烟史：已戒烟，累计6年。饮酒史：每月4次少量饮酒。职业接触史：曾在木材加工岗位接触粉尘</w:t>
-      </w:r>
-    </w:p>
-    <w:p>
-      <w:r>
-        <w:rPr>
-          <w:rFonts w:eastAsia="PingFang SC"/>
-          <w:sz w:val="22"/>
-        </w:rPr>
-        <w:t xml:space="preserve"/>
-      </w:r>
-    </w:p>
-    <w:p>
-      <w:r>
-        <w:rPr>
-          <w:rFonts w:eastAsia="PingFang SC"/>
-          <w:sz w:val="22"/>
-        </w:rPr>
         <w:t xml:space="preserve">处方核对</w:t>
       </w:r>
     </w:p>
@@ -161,7 +188,7 @@
           <w:rFonts w:eastAsia="PingFang SC"/>
           <w:sz w:val="22"/>
         </w:rPr>
-        <w:t xml:space="preserve">比索洛尔 250mg，隔日一次，active</w:t>
+        <w:t xml:space="preserve">比索洛尔 2.5mg，每日一次，正在服用</w:t>
       </w:r>
     </w:p>
     <w:sectPr>

</xml_diff>